<commit_message>
Adding parsing of math expressions
</commit_message>
<xml_diff>
--- a/TestFile_1.docx
+++ b/TestFile_1.docx
@@ -13,7 +13,7 @@
         <w:t xml:space="preserve">Рисунок </w:t>
       </w:r>
       <w:r>
-        <w:t>{}</w:t>
+        <w:t>1</w:t>
       </w:r>
       <w:r>
         <w:t xml:space="preserve"> – тестовый рисунок 1</w:t>
@@ -31,7 +31,7 @@
         <w:t xml:space="preserve">Рисунок </w:t>
       </w:r>
       <w:r>
-        <w:t>{}</w:t>
+        <w:t>2</w:t>
       </w:r>
       <w:r>
         <w:t xml:space="preserve"> – тестовый рисунок 2</w:t>
@@ -49,7 +49,7 @@
         <w:t xml:space="preserve">Рисунок </w:t>
       </w:r>
       <w:r>
-        <w:t>{}</w:t>
+        <w:t>3</w:t>
       </w:r>
       <w:r>
         <w:t xml:space="preserve"> – тестовый рисунок </w:t>
@@ -64,7 +64,7 @@
         <w:t xml:space="preserve">Рисунок </w:t>
       </w:r>
       <w:r>
-        <w:t>{}</w:t>
+        <w:t>4</w:t>
       </w:r>
       <w:r>
         <w:t xml:space="preserve"> – тестовый рисунок </w:t>
@@ -84,7 +84,7 @@
         <w:t xml:space="preserve">Рисунок </w:t>
       </w:r>
       <w:r>
-        <w:t>{}</w:t>
+        <w:t>5</w:t>
       </w:r>
       <w:r>
         <w:t xml:space="preserve"> – тестовый рисунок </w:t>

</xml_diff>

<commit_message>
In text numbering fixing
</commit_message>
<xml_diff>
--- a/TestFile_1.docx
+++ b/TestFile_1.docx
@@ -13,7 +13,7 @@
         <w:t xml:space="preserve">Рисунок </w:t>
       </w:r>
       <w:r>
-        <w:t>1</w:t>
+        <w:t>{}</w:t>
       </w:r>
       <w:r>
         <w:t xml:space="preserve"> – тестовый рисунок 1</w:t>
@@ -31,7 +31,7 @@
         <w:t xml:space="preserve">Рисунок </w:t>
       </w:r>
       <w:r>
-        <w:t>2</w:t>
+        <w:t>{}</w:t>
       </w:r>
       <w:r>
         <w:t xml:space="preserve"> – тестовый рисунок 2</w:t>
@@ -49,14 +49,14 @@
         <w:t xml:space="preserve">Рисунок </w:t>
       </w:r>
       <w:r>
+        <w:t>{}</w:t>
+      </w:r>
+      <w:r>
+        <w:t xml:space="preserve"> – тестовый рисунок </w:t>
+      </w:r>
+      <w:r>
         <w:t>3</w:t>
       </w:r>
-      <w:r>
-        <w:t xml:space="preserve"> – тестовый рисунок </w:t>
-      </w:r>
-      <w:r>
-        <w:t>3</w:t>
-      </w:r>
     </w:p>
     <w:p/>
     <w:p>
@@ -64,7 +64,7 @@
         <w:t xml:space="preserve">Рисунок </w:t>
       </w:r>
       <w:r>
-        <w:t>4</w:t>
+        <w:t>{}</w:t>
       </w:r>
       <w:r>
         <w:t xml:space="preserve"> – тестовый рисунок </w:t>
@@ -84,7 +84,7 @@
         <w:t xml:space="preserve">Рисунок </w:t>
       </w:r>
       <w:r>
-        <w:t>5</w:t>
+        <w:t>{}</w:t>
       </w:r>
       <w:r>
         <w:t xml:space="preserve"> – тестовый рисунок </w:t>

</xml_diff>